<commit_message>
chore: content and token syntax updates
Update hero body copy to name-drop FEMA and UPS directly.
- Swap C2C/W2 order to W2/C2C in availability badge
- Add name to About section opening
- Rewrite About to remove contractor-only language
- Add About back to nav
- Improve Experience bullet copy with action + impact
- Update 4 Arrows tech stack, add C#/.NET, Docmosis
- Update Apax tech stack, add PHP and Drupal
- Update KFG tech stack, drop Bootstrap and Git
- Update resume summary, bump to 11 years
- Drop Docker/editor config bullet from resume
- Add TFVC to UPS resume tech stack
- Commit photo1.jpg to public
- Migrate var() token syntax to Tailwind v4 shorthand
</commit_message>
<xml_diff>
--- a/public/MatthewSmithResume.docx
+++ b/public/MatthewSmithResume.docx
@@ -14,7 +14,7 @@
           <w:sz w:val="36"/>
           <w:szCs w:val="36"/>
         </w:rPr>
-        <w:t>Matthew B. Smith</w:t>
+        <w:t>Matthew Smith</w:t>
       </w:r>
     </w:p>
     <w:p>
@@ -109,13 +109,19 @@
     </w:p>
     <w:p>
       <w:r>
-        <w:t xml:space="preserve">Senior Software Engineer with 10+ years delivering production systems across federal and private sectors. Currently embedded at 4 Arrows Consulting building mission-critical FEMA preparedness platforms in Java, Spring Boot, C#, </w:t>
-      </w:r>
-      <w:r>
-        <w:t xml:space="preserve">.NET </w:t>
-      </w:r>
-      <w:r>
-        <w:t>and TypeScript. Experienced across the full stack in regulated, high-availability environments with a consistent focus on clean architecture and maintainable code.</w:t>
+        <w:t xml:space="preserve">Senior Software Engineer with 11 years delivering production systems across federal and private sectors. Currently at 4 Arrows Consulting building FEMA preparedness platforms in </w:t>
+      </w:r>
+      <w:r>
+        <w:t xml:space="preserve">Spring Boot, </w:t>
+      </w:r>
+      <w:r>
+        <w:t>Svelte</w:t>
+      </w:r>
+      <w:r>
+        <w:t xml:space="preserve">, React, </w:t>
+      </w:r>
+      <w:r>
+        <w:t>C#, .NET. Experienced across the full stack in regulated, high-availability environments with a consistent focus on clean architecture and maintainable code.</w:t>
       </w:r>
     </w:p>
     <w:p>
@@ -351,7 +357,118 @@
         <w:spacing w:before="40" w:after="40"/>
       </w:pPr>
       <w:r>
-        <w:t>Translated FEMA program requirements (THIRA/SPR, CPG, NIMS, UAWG) into technical solutions, coordinating with project leads to meet federal compliance and security standards.</w:t>
+        <w:t>Translated FEMA program requirements (THIRA/SPR, CPG, NIMS, UAWG) into technical solutions, coordinating with project leads to meet federal compliance and security standards</w:t>
+      </w:r>
+      <w:r>
+        <w:t>.</w:t>
+      </w:r>
+    </w:p>
+    <w:p>
+      <w:pPr>
+        <w:spacing w:before="60"/>
+      </w:pPr>
+      <w:r>
+        <w:rPr>
+          <w:b/>
+          <w:bCs/>
+          <w:color w:val="444444"/>
+          <w:sz w:val="18"/>
+          <w:szCs w:val="18"/>
+        </w:rPr>
+        <w:t xml:space="preserve">Tech Stack: </w:t>
+      </w:r>
+      <w:r>
+        <w:rPr>
+          <w:color w:val="444444"/>
+          <w:sz w:val="18"/>
+          <w:szCs w:val="18"/>
+        </w:rPr>
+        <w:t>Java, Spring Boot, C#, .NET, Gradle, GWT, MySQL,</w:t>
+      </w:r>
+      <w:r>
+        <w:rPr>
+          <w:color w:val="444444"/>
+          <w:sz w:val="18"/>
+          <w:szCs w:val="18"/>
+        </w:rPr>
+        <w:t xml:space="preserve"> Flyway,</w:t>
+      </w:r>
+      <w:r>
+        <w:rPr>
+          <w:color w:val="444444"/>
+          <w:sz w:val="18"/>
+          <w:szCs w:val="18"/>
+        </w:rPr>
+        <w:t xml:space="preserve"> Liferay 7, TypeScript, Svelte, React, Node.js, AWS Lambda, </w:t>
+      </w:r>
+      <w:r>
+        <w:rPr>
+          <w:color w:val="444444"/>
+          <w:sz w:val="18"/>
+          <w:szCs w:val="18"/>
+        </w:rPr>
+        <w:t xml:space="preserve">API Gateway, CloudFront, </w:t>
+      </w:r>
+      <w:r>
+        <w:rPr>
+          <w:color w:val="444444"/>
+          <w:sz w:val="18"/>
+          <w:szCs w:val="18"/>
+        </w:rPr>
+        <w:t>Docker/Podman, Git</w:t>
+      </w:r>
+    </w:p>
+    <w:p>
+      <w:pPr>
+        <w:spacing w:before="80"/>
+      </w:pPr>
+    </w:p>
+    <w:p>
+      <w:pPr>
+        <w:tabs>
+          <w:tab w:val="right" w:pos="9360"/>
+        </w:tabs>
+        <w:spacing w:before="160" w:after="40"/>
+      </w:pPr>
+      <w:r>
+        <w:rPr>
+          <w:b/>
+          <w:bCs/>
+          <w:sz w:val="22"/>
+          <w:szCs w:val="22"/>
+        </w:rPr>
+        <w:t>Applications Developer</w:t>
+      </w:r>
+      <w:r>
+        <w:rPr>
+          <w:color w:val="505050"/>
+          <w:sz w:val="22"/>
+          <w:szCs w:val="22"/>
+        </w:rPr>
+        <w:t xml:space="preserve"> | </w:t>
+      </w:r>
+      <w:r>
+        <w:rPr>
+          <w:b/>
+          <w:bCs/>
+          <w:color w:val="2A5DB0"/>
+          <w:sz w:val="22"/>
+          <w:szCs w:val="22"/>
+        </w:rPr>
+        <w:t>United Parcel Service (UPS)</w:t>
+      </w:r>
+      <w:r>
+        <w:rPr>
+          <w:color w:val="666666"/>
+        </w:rPr>
+        <w:t xml:space="preserve"> · Louisville, KY</w:t>
+      </w:r>
+      <w:r>
+        <w:rPr>
+          <w:color w:val="666666"/>
+        </w:rPr>
+        <w:tab/>
+        <w:t>2017 – 2019</w:t>
       </w:r>
     </w:p>
     <w:p>
@@ -364,83 +481,7 @@
         <w:spacing w:before="40" w:after="40"/>
       </w:pPr>
       <w:r>
-        <w:t>Maintained containerized development environments using Docker/Podman with Flyway-based database migrations; standardized editor configurations across VS Code, IntelliJ, and Visual Studio to eliminate noise commits.</w:t>
-      </w:r>
-    </w:p>
-    <w:p>
-      <w:pPr>
-        <w:spacing w:before="60"/>
-      </w:pPr>
-      <w:r>
-        <w:rPr>
-          <w:b/>
-          <w:bCs/>
-          <w:color w:val="444444"/>
-          <w:sz w:val="18"/>
-          <w:szCs w:val="18"/>
-        </w:rPr>
-        <w:t xml:space="preserve">Tech Stack: </w:t>
-      </w:r>
-      <w:r>
-        <w:rPr>
-          <w:color w:val="444444"/>
-          <w:sz w:val="18"/>
-          <w:szCs w:val="18"/>
-        </w:rPr>
-        <w:t>Java, Spring Boot, C#, .NET, Gradle, GWT, MySQL, Liferay 7, TypeScript, Svelte, React, Node.js, AWS Lambda, Docker/Podman, Git</w:t>
-      </w:r>
-    </w:p>
-    <w:p>
-      <w:pPr>
-        <w:spacing w:before="80"/>
-      </w:pPr>
-    </w:p>
-    <w:p>
-      <w:pPr>
-        <w:tabs>
-          <w:tab w:val="right" w:pos="9360"/>
-        </w:tabs>
-        <w:spacing w:before="160" w:after="40"/>
-      </w:pPr>
-      <w:r>
-        <w:rPr>
-          <w:b/>
-          <w:bCs/>
-          <w:sz w:val="22"/>
-          <w:szCs w:val="22"/>
-        </w:rPr>
-        <w:t>Applications Developer</w:t>
-      </w:r>
-      <w:r>
-        <w:rPr>
-          <w:color w:val="505050"/>
-          <w:sz w:val="22"/>
-          <w:szCs w:val="22"/>
-        </w:rPr>
-        <w:t xml:space="preserve"> | </w:t>
-      </w:r>
-      <w:r>
-        <w:rPr>
-          <w:b/>
-          <w:bCs/>
-          <w:color w:val="2A5DB0"/>
-          <w:sz w:val="22"/>
-          <w:szCs w:val="22"/>
-        </w:rPr>
-        <w:t>United Parcel Service (UPS)</w:t>
-      </w:r>
-      <w:r>
-        <w:rPr>
-          <w:color w:val="666666"/>
-        </w:rPr>
-        <w:t xml:space="preserve"> · Louisville, KY</w:t>
-      </w:r>
-      <w:r>
-        <w:rPr>
-          <w:color w:val="666666"/>
-        </w:rPr>
-        <w:tab/>
-        <w:t>2017 – 2019</w:t>
+        <w:t>Engineered backend logic and UI features for real-time transportation visibility systems in a 24/7 high-throughput production environment.</w:t>
       </w:r>
     </w:p>
     <w:p>
@@ -453,7 +494,7 @@
         <w:spacing w:before="40" w:after="40"/>
       </w:pPr>
       <w:r>
-        <w:t>Engineered backend logic and UI features for real-time transportation visibility systems in a 24/7 high-throughput production environment.</w:t>
+        <w:t>Translated business requirements into discrete rules for the Drools inference engine (BRMS), decoupling policy from application code and reducing manual intervention.</w:t>
       </w:r>
     </w:p>
     <w:p>
@@ -466,7 +507,98 @@
         <w:spacing w:before="40" w:after="40"/>
       </w:pPr>
       <w:r>
-        <w:t>Translated business requirements into discrete rules for the Drools inference engine (BRMS), decoupling policy from application code and reducing manual intervention.</w:t>
+        <w:t>Identified and resolved critical latency bottlenecks under peak traffic through targeted performance analysis with JMeter.</w:t>
+      </w:r>
+    </w:p>
+    <w:p>
+      <w:pPr>
+        <w:spacing w:before="60"/>
+      </w:pPr>
+      <w:r>
+        <w:rPr>
+          <w:b/>
+          <w:bCs/>
+          <w:color w:val="444444"/>
+          <w:sz w:val="18"/>
+          <w:szCs w:val="18"/>
+        </w:rPr>
+        <w:t xml:space="preserve">Tech Stack: </w:t>
+      </w:r>
+      <w:r>
+        <w:rPr>
+          <w:color w:val="444444"/>
+          <w:sz w:val="18"/>
+          <w:szCs w:val="18"/>
+        </w:rPr>
+        <w:t>Java, Spring Framework, Maven/Gradle, Drools (BRMS), JMeter, WebLogic, ActiveMQ, SQL Server, TFVC</w:t>
+      </w:r>
+    </w:p>
+    <w:p>
+      <w:pPr>
+        <w:rPr>
+          <w:b/>
+          <w:bCs/>
+          <w:sz w:val="22"/>
+          <w:szCs w:val="22"/>
+        </w:rPr>
+      </w:pPr>
+      <w:r>
+        <w:rPr>
+          <w:b/>
+          <w:bCs/>
+          <w:sz w:val="22"/>
+          <w:szCs w:val="22"/>
+        </w:rPr>
+        <w:br w:type="page"/>
+      </w:r>
+    </w:p>
+    <w:p>
+      <w:pPr>
+        <w:tabs>
+          <w:tab w:val="right" w:pos="9360"/>
+        </w:tabs>
+        <w:spacing w:before="160" w:after="40"/>
+      </w:pPr>
+      <w:r>
+        <w:rPr>
+          <w:b/>
+          <w:bCs/>
+          <w:sz w:val="22"/>
+          <w:szCs w:val="22"/>
+        </w:rPr>
+        <w:lastRenderedPageBreak/>
+        <w:t>Software Developer</w:t>
+      </w:r>
+      <w:r>
+        <w:rPr>
+          <w:color w:val="505050"/>
+          <w:sz w:val="22"/>
+          <w:szCs w:val="22"/>
+        </w:rPr>
+        <w:t xml:space="preserve"> | </w:t>
+      </w:r>
+      <w:r>
+        <w:rPr>
+          <w:b/>
+          <w:bCs/>
+          <w:color w:val="2A5DB0"/>
+          <w:sz w:val="22"/>
+          <w:szCs w:val="22"/>
+        </w:rPr>
+        <w:t>Apax Software</w:t>
+      </w:r>
+      <w:r>
+        <w:rPr>
+          <w:color w:val="666666"/>
+        </w:rPr>
+        <w:t xml:space="preserve"> · Lexington, KY</w:t>
+      </w:r>
+      <w:r>
+        <w:rPr>
+          <w:color w:val="666666"/>
+        </w:rPr>
+        <w:tab/>
+        <w:t>2016 – 2017</w:t>
       </w:r>
     </w:p>
     <w:p>
@@ -479,84 +611,7 @@
         <w:spacing w:before="40" w:after="40"/>
       </w:pPr>
       <w:r>
-        <w:t>Identified and resolved critical latency bottlenecks under peak traffic through targeted performance analysis with JMeter.</w:t>
-      </w:r>
-    </w:p>
-    <w:p>
-      <w:pPr>
-        <w:spacing w:before="60"/>
-      </w:pPr>
-      <w:r>
-        <w:rPr>
-          <w:b/>
-          <w:bCs/>
-          <w:color w:val="444444"/>
-          <w:sz w:val="18"/>
-          <w:szCs w:val="18"/>
-        </w:rPr>
-        <w:t xml:space="preserve">Tech Stack: </w:t>
-      </w:r>
-      <w:r>
-        <w:rPr>
-          <w:color w:val="444444"/>
-          <w:sz w:val="18"/>
-          <w:szCs w:val="18"/>
-        </w:rPr>
-        <w:t>Java, Spring Framework, Maven/Gradle, Drools (BRMS), JMeter, WebLogic, ActiveMQ, SQL Server</w:t>
-      </w:r>
-    </w:p>
-    <w:p>
-      <w:pPr>
-        <w:spacing w:before="80"/>
-      </w:pPr>
-    </w:p>
-    <w:p>
-      <w:pPr>
-        <w:tabs>
-          <w:tab w:val="right" w:pos="9360"/>
-        </w:tabs>
-        <w:spacing w:before="160" w:after="40"/>
-      </w:pPr>
-      <w:r>
-        <w:rPr>
-          <w:b/>
-          <w:bCs/>
-          <w:sz w:val="22"/>
-          <w:szCs w:val="22"/>
-        </w:rPr>
-        <w:lastRenderedPageBreak/>
-        <w:t>Software Developer</w:t>
-      </w:r>
-      <w:r>
-        <w:rPr>
-          <w:color w:val="505050"/>
-          <w:sz w:val="22"/>
-          <w:szCs w:val="22"/>
-        </w:rPr>
-        <w:t xml:space="preserve"> | </w:t>
-      </w:r>
-      <w:r>
-        <w:rPr>
-          <w:b/>
-          <w:bCs/>
-          <w:color w:val="2A5DB0"/>
-          <w:sz w:val="22"/>
-          <w:szCs w:val="22"/>
-        </w:rPr>
-        <w:t>Apax Software</w:t>
-      </w:r>
-      <w:r>
-        <w:rPr>
-          <w:color w:val="666666"/>
-        </w:rPr>
-        <w:t xml:space="preserve"> · Lexington, KY</w:t>
-      </w:r>
-      <w:r>
-        <w:rPr>
-          <w:color w:val="666666"/>
-        </w:rPr>
-        <w:tab/>
-        <w:t>2016 – 2017</w:t>
+        <w:t>Built reusable backend components and modular UI features across multiple client projects, accelerating release cycles and enabling scalable feature expansion.</w:t>
       </w:r>
     </w:p>
     <w:p>
@@ -569,7 +624,7 @@
         <w:spacing w:before="40" w:after="40"/>
       </w:pPr>
       <w:r>
-        <w:t>Built reusable backend components and modular UI features across multiple client projects, accelerating release cycles and enabling scalable feature expansion.</w:t>
+        <w:t>Translated stakeholder requirements into production-ready RESTful APIs for clients including Presbyterian Church USA and the University of Kentucky.</w:t>
       </w:r>
     </w:p>
     <w:p>
@@ -582,7 +637,83 @@
         <w:spacing w:before="40" w:after="40"/>
       </w:pPr>
       <w:r>
-        <w:t>Translated stakeholder requirements into production-ready RESTful APIs for clients including Presbyterian Church USA and the University of Kentucky.</w:t>
+        <w:t>Implemented server-side validation, authentication, and RBAC for sensitive event registration and CMS workflows.</w:t>
+      </w:r>
+    </w:p>
+    <w:p>
+      <w:pPr>
+        <w:spacing w:before="60"/>
+      </w:pPr>
+      <w:r>
+        <w:rPr>
+          <w:b/>
+          <w:bCs/>
+          <w:color w:val="444444"/>
+          <w:sz w:val="18"/>
+          <w:szCs w:val="18"/>
+        </w:rPr>
+        <w:t xml:space="preserve">Tech Stack: </w:t>
+      </w:r>
+      <w:r>
+        <w:rPr>
+          <w:color w:val="444444"/>
+          <w:sz w:val="18"/>
+          <w:szCs w:val="18"/>
+        </w:rPr>
+        <w:t>Python, Django, JavaScript (AngularJS, jQuery), PostgreSQL, Bootstrap, AWS, Git, PHP, Drupal</w:t>
+      </w:r>
+    </w:p>
+    <w:p>
+      <w:pPr>
+        <w:spacing w:before="80"/>
+      </w:pPr>
+    </w:p>
+    <w:p>
+      <w:pPr>
+        <w:tabs>
+          <w:tab w:val="right" w:pos="9360"/>
+        </w:tabs>
+        <w:spacing w:before="160" w:after="40"/>
+      </w:pPr>
+      <w:r>
+        <w:rPr>
+          <w:b/>
+          <w:bCs/>
+          <w:sz w:val="22"/>
+          <w:szCs w:val="22"/>
+        </w:rPr>
+        <w:t>Programming Analyst</w:t>
+      </w:r>
+      <w:r>
+        <w:rPr>
+          <w:color w:val="505050"/>
+          <w:sz w:val="22"/>
+          <w:szCs w:val="22"/>
+        </w:rPr>
+        <w:t xml:space="preserve"> | </w:t>
+      </w:r>
+      <w:r>
+        <w:rPr>
+          <w:b/>
+          <w:bCs/>
+          <w:color w:val="2A5DB0"/>
+          <w:sz w:val="22"/>
+          <w:szCs w:val="22"/>
+        </w:rPr>
+        <w:t>Knowledge Facilitations Group (KFG)</w:t>
+      </w:r>
+      <w:r>
+        <w:rPr>
+          <w:color w:val="666666"/>
+        </w:rPr>
+        <w:t xml:space="preserve"> · Richmond, KY</w:t>
+      </w:r>
+      <w:r>
+        <w:rPr>
+          <w:color w:val="666666"/>
+        </w:rPr>
+        <w:tab/>
+        <w:t>2015 – 2016</w:t>
       </w:r>
     </w:p>
     <w:p>
@@ -595,83 +726,7 @@
         <w:spacing w:before="40" w:after="40"/>
       </w:pPr>
       <w:r>
-        <w:t>Implemented server-side validation, authentication, and RBAC for sensitive event registration and CMS workflows.</w:t>
-      </w:r>
-    </w:p>
-    <w:p>
-      <w:pPr>
-        <w:spacing w:before="60"/>
-      </w:pPr>
-      <w:r>
-        <w:rPr>
-          <w:b/>
-          <w:bCs/>
-          <w:color w:val="444444"/>
-          <w:sz w:val="18"/>
-          <w:szCs w:val="18"/>
-        </w:rPr>
-        <w:t xml:space="preserve">Tech Stack: </w:t>
-      </w:r>
-      <w:r>
-        <w:rPr>
-          <w:color w:val="444444"/>
-          <w:sz w:val="18"/>
-          <w:szCs w:val="18"/>
-        </w:rPr>
-        <w:t>Python, Django, JavaScript (AngularJS, jQuery), PostgreSQL, Bootstrap, AWS, Git, PHP, Drupal</w:t>
-      </w:r>
-    </w:p>
-    <w:p>
-      <w:pPr>
-        <w:spacing w:before="80"/>
-      </w:pPr>
-    </w:p>
-    <w:p>
-      <w:pPr>
-        <w:tabs>
-          <w:tab w:val="right" w:pos="9360"/>
-        </w:tabs>
-        <w:spacing w:before="160" w:after="40"/>
-      </w:pPr>
-      <w:r>
-        <w:rPr>
-          <w:b/>
-          <w:bCs/>
-          <w:sz w:val="22"/>
-          <w:szCs w:val="22"/>
-        </w:rPr>
-        <w:t>Programming Analyst</w:t>
-      </w:r>
-      <w:r>
-        <w:rPr>
-          <w:color w:val="505050"/>
-          <w:sz w:val="22"/>
-          <w:szCs w:val="22"/>
-        </w:rPr>
-        <w:t xml:space="preserve"> | </w:t>
-      </w:r>
-      <w:r>
-        <w:rPr>
-          <w:b/>
-          <w:bCs/>
-          <w:color w:val="2A5DB0"/>
-          <w:sz w:val="22"/>
-          <w:szCs w:val="22"/>
-        </w:rPr>
-        <w:t>Knowledge Facilitations Group (KFG)</w:t>
-      </w:r>
-      <w:r>
-        <w:rPr>
-          <w:color w:val="666666"/>
-        </w:rPr>
-        <w:t xml:space="preserve"> · Richmond, KY</w:t>
-      </w:r>
-      <w:r>
-        <w:rPr>
-          <w:color w:val="666666"/>
-        </w:rPr>
-        <w:tab/>
-        <w:t>2015 – 2016</w:t>
+        <w:t>Developed Python-based transformation engines to validate and map disparate industry standards (X12, EDIFACT, XML, JSON) for seamless data exchange across the EDITRACE platform.</w:t>
       </w:r>
     </w:p>
     <w:p>
@@ -684,19 +739,6 @@
         <w:spacing w:before="40" w:after="40"/>
       </w:pPr>
       <w:r>
-        <w:t>Developed Python-based transformation engines to validate and map disparate industry standards (X12, EDIFACT, XML, JSON) for seamless data exchange across the EDITRACE platform.</w:t>
-      </w:r>
-    </w:p>
-    <w:p>
-      <w:pPr>
-        <w:pStyle w:val="ListParagraph"/>
-        <w:numPr>
-          <w:ilvl w:val="0"/>
-          <w:numId w:val="2"/>
-        </w:numPr>
-        <w:spacing w:before="40" w:after="40"/>
-      </w:pPr>
-      <w:r>
         <w:t>Built real-time monitoring dashboards providing immediate visibility into automated EDI data pipelines, reducing troubleshooting time for critical processes.</w:t>
       </w:r>
     </w:p>
@@ -767,7 +809,7 @@
         <w:rPr>
           <w:color w:val="444444"/>
         </w:rPr>
-        <w:t xml:space="preserve">  ·  Eastern Kentucky University, Richmond, KY</w:t>
+        <w:t xml:space="preserve"> · Eastern Kentucky University, Richmond, KY</w:t>
       </w:r>
       <w:r>
         <w:rPr>
@@ -1436,7 +1478,6 @@
   <w:style w:type="character" w:default="1" w:styleId="DefaultParagraphFont">
     <w:name w:val="Default Paragraph Font"/>
     <w:uiPriority w:val="1"/>
-    <w:semiHidden/>
     <w:unhideWhenUsed/>
   </w:style>
   <w:style w:type="table" w:default="1" w:styleId="TableNormal">

</xml_diff>

<commit_message>
work: rewrite highlights, experience, and resume copy
- Refined FEMA/4 Arrows experience and case study for clarity and accuracy.
- Updated resume PDF/DOCX and Experience section to match new language.
- Renamed "Work" to "Highlights" and improved project descriptions.
- Adjusted supporting project copy for clarity and personal voice.
- Updated navigation and section order for better flow.
</commit_message>
<xml_diff>
--- a/public/MatthewSmithResume.docx
+++ b/public/MatthewSmithResume.docx
@@ -121,7 +121,13 @@
         <w:t xml:space="preserve">, React, </w:t>
       </w:r>
       <w:r>
-        <w:t>C#, .NET. Experienced across the full stack in regulated, high-availability environments with a consistent focus on clean architecture and maintainable code.</w:t>
+        <w:t xml:space="preserve">C#, </w:t>
+      </w:r>
+      <w:r>
+        <w:t xml:space="preserve">and </w:t>
+      </w:r>
+      <w:r>
+        <w:t>.NET. Experienced across the full stack in regulated, high-availability environments with a consistent focus on clean architecture and maintainable code.</w:t>
       </w:r>
     </w:p>
     <w:p>
@@ -205,7 +211,15 @@
         <w:t xml:space="preserve">DevOps &amp; Tools: </w:t>
       </w:r>
       <w:r>
-        <w:t>Docker/Podman, Gradle, Maven, AWS (Lambda, S3), Git, Apache Tomcat</w:t>
+        <w:t>Docker/</w:t>
+      </w:r>
+      <w:proofErr w:type="spellStart"/>
+      <w:r>
+        <w:t>Podman</w:t>
+      </w:r>
+      <w:proofErr w:type="spellEnd"/>
+      <w:r>
+        <w:t>, Gradle, Maven, AWS (Lambda, S3), Git, Apache Tomcat</w:t>
       </w:r>
     </w:p>
     <w:p>
@@ -220,7 +234,15 @@
         <w:t xml:space="preserve">Platforms: </w:t>
       </w:r>
       <w:r>
-        <w:t>Liferay 7, Node.js, npm, Cloudflare Workers &amp; Pages</w:t>
+        <w:t xml:space="preserve">Liferay 7, Node.js, </w:t>
+      </w:r>
+      <w:proofErr w:type="spellStart"/>
+      <w:r>
+        <w:t>npm</w:t>
+      </w:r>
+      <w:proofErr w:type="spellEnd"/>
+      <w:r>
+        <w:t>, Cloudflare Workers &amp; Pages</w:t>
       </w:r>
     </w:p>
     <w:p>
@@ -305,7 +327,31 @@
         <w:spacing w:before="40" w:after="40"/>
       </w:pPr>
       <w:r>
-        <w:t>Designed and built the Svelte frontend for a TypeScript monorepo of AWS serverless applications serving as a unified access portal for FEMA platforms including PrepToolkit, RTLT, RIS, and OneResponder.</w:t>
+        <w:t xml:space="preserve">Designed and built the Svelte frontend for a TypeScript </w:t>
+      </w:r>
+      <w:proofErr w:type="spellStart"/>
+      <w:r>
+        <w:t>monorepo</w:t>
+      </w:r>
+      <w:proofErr w:type="spellEnd"/>
+      <w:r>
+        <w:t xml:space="preserve"> of AWS serverless applications serving as a unified access portal for FEMA platforms including </w:t>
+      </w:r>
+      <w:proofErr w:type="spellStart"/>
+      <w:r>
+        <w:t>PrepToolkit</w:t>
+      </w:r>
+      <w:proofErr w:type="spellEnd"/>
+      <w:r>
+        <w:t xml:space="preserve">, RTLT, RIS, and </w:t>
+      </w:r>
+      <w:proofErr w:type="spellStart"/>
+      <w:r>
+        <w:t>OneResponder</w:t>
+      </w:r>
+      <w:proofErr w:type="spellEnd"/>
+      <w:r>
+        <w:t>.</w:t>
       </w:r>
     </w:p>
     <w:p>
@@ -318,7 +364,7 @@
         <w:spacing w:before="40" w:after="40"/>
       </w:pPr>
       <w:r>
-        <w:t>Built real-time presence tracking for the Unified Reporting Tool, including distributed session logic and polling timeouts to keep data consistent across concurrent federal users.</w:t>
+        <w:t>Built real-time presence tracking for the Unified Reporting Tool (URT), using session records, polling, and configurable timeout behavior to reduce accidental overwrite risk across concurrent federal users.</w:t>
       </w:r>
     </w:p>
     <w:p>
@@ -331,7 +377,15 @@
         <w:spacing w:before="40" w:after="40"/>
       </w:pPr>
       <w:r>
-        <w:t>Automated enterprise reporting with Docmosis and Apache POI, cutting processing time from hours to minutes for national emergency preparedness programs.</w:t>
+        <w:t xml:space="preserve">Automated enterprise reporting with </w:t>
+      </w:r>
+      <w:proofErr w:type="spellStart"/>
+      <w:r>
+        <w:t>Docmosis</w:t>
+      </w:r>
+      <w:proofErr w:type="spellEnd"/>
+      <w:r>
+        <w:t xml:space="preserve"> and Apache POI, cutting processing time from hours to minutes for national emergency preparedness programs.</w:t>
       </w:r>
     </w:p>
     <w:p>
@@ -415,7 +469,25 @@
           <w:sz w:val="18"/>
           <w:szCs w:val="18"/>
         </w:rPr>
-        <w:t>Docker/Podman, Git</w:t>
+        <w:t>Docker/</w:t>
+      </w:r>
+      <w:proofErr w:type="spellStart"/>
+      <w:r>
+        <w:rPr>
+          <w:color w:val="444444"/>
+          <w:sz w:val="18"/>
+          <w:szCs w:val="18"/>
+        </w:rPr>
+        <w:t>Podman</w:t>
+      </w:r>
+      <w:proofErr w:type="spellEnd"/>
+      <w:r>
+        <w:rPr>
+          <w:color w:val="444444"/>
+          <w:sz w:val="18"/>
+          <w:szCs w:val="18"/>
+        </w:rPr>
+        <w:t>, Git</w:t>
       </w:r>
     </w:p>
     <w:p>
@@ -611,7 +683,7 @@
         <w:spacing w:before="40" w:after="40"/>
       </w:pPr>
       <w:r>
-        <w:t>Built reusable backend components and modular UI features across multiple client projects, accelerating release cycles and enabling scalable feature expansion.</w:t>
+        <w:t>Built reusable backend components and modular UI features across multiple client projects, helping teams ship without rebuilding the same foundations.</w:t>
       </w:r>
     </w:p>
     <w:p>
@@ -624,7 +696,7 @@
         <w:spacing w:before="40" w:after="40"/>
       </w:pPr>
       <w:r>
-        <w:t>Translated stakeholder requirements into production-ready RESTful APIs for clients including Presbyterian Church USA and the University of Kentucky.</w:t>
+        <w:t>Translated stakeholder requirements into production REST APIs for clients including Presbyterian Church USA and the University of Kentucky.</w:t>
       </w:r>
     </w:p>
     <w:p>
@@ -762,7 +834,25 @@
           <w:sz w:val="18"/>
           <w:szCs w:val="18"/>
         </w:rPr>
-        <w:t>Python, EDI (X12, XML, EDIFACT, Tradacoms, JSON, IDoc), Bootstrap, Git</w:t>
+        <w:t xml:space="preserve">Python, EDI (X12, XML, EDIFACT, </w:t>
+      </w:r>
+      <w:proofErr w:type="spellStart"/>
+      <w:r>
+        <w:rPr>
+          <w:color w:val="444444"/>
+          <w:sz w:val="18"/>
+          <w:szCs w:val="18"/>
+        </w:rPr>
+        <w:t>Tradacoms</w:t>
+      </w:r>
+      <w:proofErr w:type="spellEnd"/>
+      <w:r>
+        <w:rPr>
+          <w:color w:val="444444"/>
+          <w:sz w:val="18"/>
+          <w:szCs w:val="18"/>
+        </w:rPr>
+        <w:t>, JSON, IDoc), Bootstrap, Git</w:t>
       </w:r>
     </w:p>
     <w:p>

</xml_diff>

<commit_message>
feat: restructure highlighted work, drop About
Replace single featured work item with two equal-weight
FEMA case studies, each with Problem/Decision/Outcome.

Remove About section and nav link.

Rename Work.tsx to HighlightedWork.tsx and update /services
copy to remove geography and broaden client framing.
</commit_message>
<xml_diff>
--- a/public/MatthewSmithResume.docx
+++ b/public/MatthewSmithResume.docx
@@ -327,31 +327,7 @@
         <w:spacing w:before="40" w:after="40"/>
       </w:pPr>
       <w:r>
-        <w:t xml:space="preserve">Designed and built the Svelte frontend for a TypeScript </w:t>
-      </w:r>
-      <w:proofErr w:type="spellStart"/>
-      <w:r>
-        <w:t>monorepo</w:t>
-      </w:r>
-      <w:proofErr w:type="spellEnd"/>
-      <w:r>
-        <w:t xml:space="preserve"> of AWS serverless applications serving as a unified access portal for FEMA platforms including </w:t>
-      </w:r>
-      <w:proofErr w:type="spellStart"/>
-      <w:r>
-        <w:t>PrepToolkit</w:t>
-      </w:r>
-      <w:proofErr w:type="spellEnd"/>
-      <w:r>
-        <w:t xml:space="preserve">, RTLT, RIS, and </w:t>
-      </w:r>
-      <w:proofErr w:type="spellStart"/>
-      <w:r>
-        <w:t>OneResponder</w:t>
-      </w:r>
-      <w:proofErr w:type="spellEnd"/>
-      <w:r>
-        <w:t>.</w:t>
+        <w:t>Built real-time presence tracking for the Unified Reporting Tool (URT), using session records, polling, and configurable timeout behavior to reduce accidental overwrite risk across concurrent federal users.</w:t>
       </w:r>
     </w:p>
     <w:p>
@@ -364,7 +340,31 @@
         <w:spacing w:before="40" w:after="40"/>
       </w:pPr>
       <w:r>
-        <w:t>Built real-time presence tracking for the Unified Reporting Tool (URT), using session records, polling, and configurable timeout behavior to reduce accidental overwrite risk across concurrent federal users.</w:t>
+        <w:t xml:space="preserve">Designed and built the Svelte frontend for a TypeScript </w:t>
+      </w:r>
+      <w:proofErr w:type="spellStart"/>
+      <w:r>
+        <w:t>monorepo</w:t>
+      </w:r>
+      <w:proofErr w:type="spellEnd"/>
+      <w:r>
+        <w:t xml:space="preserve"> of AWS serverless applications serving as a unified access portal for FEMA platforms including </w:t>
+      </w:r>
+      <w:proofErr w:type="spellStart"/>
+      <w:r>
+        <w:t>PrepToolkit</w:t>
+      </w:r>
+      <w:proofErr w:type="spellEnd"/>
+      <w:r>
+        <w:t xml:space="preserve">, RTLT, RIS, and </w:t>
+      </w:r>
+      <w:proofErr w:type="spellStart"/>
+      <w:r>
+        <w:t>OneResponder</w:t>
+      </w:r>
+      <w:proofErr w:type="spellEnd"/>
+      <w:r>
+        <w:t>.</w:t>
       </w:r>
     </w:p>
     <w:p>
@@ -1568,6 +1568,7 @@
   <w:style w:type="character" w:default="1" w:styleId="DefaultParagraphFont">
     <w:name w:val="Default Paragraph Font"/>
     <w:uiPriority w:val="1"/>
+    <w:semiHidden/>
     <w:unhideWhenUsed/>
   </w:style>
   <w:style w:type="table" w:default="1" w:styleId="TableNormal">

</xml_diff>

<commit_message>
feat: update experience + resume content
bump to v1.3.1
</commit_message>
<xml_diff>
--- a/public/MatthewSmithResume.docx
+++ b/public/MatthewSmithResume.docx
@@ -211,15 +211,7 @@
         <w:t xml:space="preserve">DevOps &amp; Tools: </w:t>
       </w:r>
       <w:r>
-        <w:t>Docker/</w:t>
-      </w:r>
-      <w:proofErr w:type="spellStart"/>
-      <w:r>
-        <w:t>Podman</w:t>
-      </w:r>
-      <w:proofErr w:type="spellEnd"/>
-      <w:r>
-        <w:t>, Gradle, Maven, AWS (Lambda, S3), Git, Apache Tomcat</w:t>
+        <w:t>Docker/Podman, Gradle, Maven, AWS (Lambda, S3), Git, Apache Tomcat</w:t>
       </w:r>
     </w:p>
     <w:p>
@@ -234,15 +226,7 @@
         <w:t xml:space="preserve">Platforms: </w:t>
       </w:r>
       <w:r>
-        <w:t xml:space="preserve">Liferay 7, Node.js, </w:t>
-      </w:r>
-      <w:proofErr w:type="spellStart"/>
-      <w:r>
-        <w:t>npm</w:t>
-      </w:r>
-      <w:proofErr w:type="spellEnd"/>
-      <w:r>
-        <w:t>, Cloudflare Workers &amp; Pages</w:t>
+        <w:t>Liferay 7, Node.js, npm, Cloudflare Workers &amp; Pages</w:t>
       </w:r>
     </w:p>
     <w:p>
@@ -340,31 +324,7 @@
         <w:spacing w:before="40" w:after="40"/>
       </w:pPr>
       <w:r>
-        <w:t xml:space="preserve">Designed and built the Svelte frontend for a TypeScript </w:t>
-      </w:r>
-      <w:proofErr w:type="spellStart"/>
-      <w:r>
-        <w:t>monorepo</w:t>
-      </w:r>
-      <w:proofErr w:type="spellEnd"/>
-      <w:r>
-        <w:t xml:space="preserve"> of AWS serverless applications serving as a unified access portal for FEMA platforms including </w:t>
-      </w:r>
-      <w:proofErr w:type="spellStart"/>
-      <w:r>
-        <w:t>PrepToolkit</w:t>
-      </w:r>
-      <w:proofErr w:type="spellEnd"/>
-      <w:r>
-        <w:t xml:space="preserve">, RTLT, RIS, and </w:t>
-      </w:r>
-      <w:proofErr w:type="spellStart"/>
-      <w:r>
-        <w:t>OneResponder</w:t>
-      </w:r>
-      <w:proofErr w:type="spellEnd"/>
-      <w:r>
-        <w:t>.</w:t>
+        <w:t>Designed and built the Svelte frontend for a TypeScript monorepo of AWS serverless applications serving as a unified access portal for FEMA platforms including PrepToolkit, RTLT, RIS, and OneResponder.</w:t>
       </w:r>
     </w:p>
     <w:p>
@@ -377,15 +337,7 @@
         <w:spacing w:before="40" w:after="40"/>
       </w:pPr>
       <w:r>
-        <w:t xml:space="preserve">Automated enterprise reporting with </w:t>
-      </w:r>
-      <w:proofErr w:type="spellStart"/>
-      <w:r>
-        <w:t>Docmosis</w:t>
-      </w:r>
-      <w:proofErr w:type="spellEnd"/>
-      <w:r>
-        <w:t xml:space="preserve"> and Apache POI, cutting processing time from hours to minutes for national emergency preparedness programs.</w:t>
+        <w:t>Automated enterprise reporting with Docmosis and Apache POI, cutting processing time from hours to minutes for national emergency preparedness programs.</w:t>
       </w:r>
     </w:p>
     <w:p>
@@ -398,7 +350,115 @@
         <w:spacing w:before="40" w:after="40"/>
       </w:pPr>
       <w:r>
-        <w:t>Delivered features across Spring Boot and .NET backends, MySQL, and Svelte frontends within the FEMA preparedness platform suite.</w:t>
+        <w:t>Delivered full-stack features that translated FEMA program requirements (THIRA/SPR, CPG, NIMS, UAWG) into technical solutions in coordination with project leads to meet federal compliance and security standards.</w:t>
+      </w:r>
+    </w:p>
+    <w:p>
+      <w:pPr>
+        <w:spacing w:before="60"/>
+      </w:pPr>
+      <w:r>
+        <w:rPr>
+          <w:b/>
+          <w:bCs/>
+          <w:color w:val="444444"/>
+          <w:sz w:val="18"/>
+          <w:szCs w:val="18"/>
+        </w:rPr>
+        <w:t xml:space="preserve">Tech Stack: </w:t>
+      </w:r>
+      <w:r>
+        <w:rPr>
+          <w:color w:val="444444"/>
+          <w:sz w:val="18"/>
+          <w:szCs w:val="18"/>
+        </w:rPr>
+        <w:t>Java, Spring Boot, C#, .NET, Gradle, GWT, MySQL,</w:t>
+      </w:r>
+      <w:r>
+        <w:rPr>
+          <w:color w:val="444444"/>
+          <w:sz w:val="18"/>
+          <w:szCs w:val="18"/>
+        </w:rPr>
+        <w:t xml:space="preserve"> Flyway,</w:t>
+      </w:r>
+      <w:r>
+        <w:rPr>
+          <w:color w:val="444444"/>
+          <w:sz w:val="18"/>
+          <w:szCs w:val="18"/>
+        </w:rPr>
+        <w:t xml:space="preserve"> Liferay 7, TypeScript, Svelte, React, Node.js, AWS Lambda, </w:t>
+      </w:r>
+      <w:r>
+        <w:rPr>
+          <w:color w:val="444444"/>
+          <w:sz w:val="18"/>
+          <w:szCs w:val="18"/>
+        </w:rPr>
+        <w:t xml:space="preserve">API Gateway, CloudFront, </w:t>
+      </w:r>
+      <w:r>
+        <w:rPr>
+          <w:color w:val="444444"/>
+          <w:sz w:val="18"/>
+          <w:szCs w:val="18"/>
+        </w:rPr>
+        <w:t>Docker/Podman, Git</w:t>
+      </w:r>
+    </w:p>
+    <w:p>
+      <w:pPr>
+        <w:spacing w:before="80"/>
+      </w:pPr>
+    </w:p>
+    <w:p>
+      <w:pPr>
+        <w:tabs>
+          <w:tab w:val="right" w:pos="9360"/>
+        </w:tabs>
+        <w:spacing w:before="160" w:after="40"/>
+      </w:pPr>
+      <w:r>
+        <w:rPr>
+          <w:b/>
+          <w:bCs/>
+          <w:sz w:val="22"/>
+          <w:szCs w:val="22"/>
+        </w:rPr>
+        <w:t>Applications Developer</w:t>
+      </w:r>
+      <w:r>
+        <w:rPr>
+          <w:color w:val="505050"/>
+          <w:sz w:val="22"/>
+          <w:szCs w:val="22"/>
+        </w:rPr>
+        <w:t xml:space="preserve"> | </w:t>
+      </w:r>
+      <w:r>
+        <w:rPr>
+          <w:b/>
+          <w:bCs/>
+          <w:color w:val="2A5DB0"/>
+          <w:sz w:val="22"/>
+          <w:szCs w:val="22"/>
+        </w:rPr>
+        <w:t>United Parcel Service (UPS)</w:t>
+      </w:r>
+      <w:r>
+        <w:rPr>
+          <w:color w:val="666666"/>
+        </w:rPr>
+        <w:t xml:space="preserve"> · Louisville, KY</w:t>
+      </w:r>
+      <w:r>
+        <w:rPr>
+          <w:color w:val="666666"/>
+        </w:rPr>
+        <w:tab/>
+        <w:t>2017 – 2019</w:t>
       </w:r>
     </w:p>
     <w:p>
@@ -411,136 +471,7 @@
         <w:spacing w:before="40" w:after="40"/>
       </w:pPr>
       <w:r>
-        <w:t>Translated FEMA program requirements (THIRA/SPR, CPG, NIMS, UAWG) into technical solutions, coordinating with project leads to meet federal compliance and security standards</w:t>
-      </w:r>
-      <w:r>
-        <w:t>.</w:t>
-      </w:r>
-    </w:p>
-    <w:p>
-      <w:pPr>
-        <w:spacing w:before="60"/>
-      </w:pPr>
-      <w:r>
-        <w:rPr>
-          <w:b/>
-          <w:bCs/>
-          <w:color w:val="444444"/>
-          <w:sz w:val="18"/>
-          <w:szCs w:val="18"/>
-        </w:rPr>
-        <w:t xml:space="preserve">Tech Stack: </w:t>
-      </w:r>
-      <w:r>
-        <w:rPr>
-          <w:color w:val="444444"/>
-          <w:sz w:val="18"/>
-          <w:szCs w:val="18"/>
-        </w:rPr>
-        <w:t>Java, Spring Boot, C#, .NET, Gradle, GWT, MySQL,</w:t>
-      </w:r>
-      <w:r>
-        <w:rPr>
-          <w:color w:val="444444"/>
-          <w:sz w:val="18"/>
-          <w:szCs w:val="18"/>
-        </w:rPr>
-        <w:t xml:space="preserve"> Flyway,</w:t>
-      </w:r>
-      <w:r>
-        <w:rPr>
-          <w:color w:val="444444"/>
-          <w:sz w:val="18"/>
-          <w:szCs w:val="18"/>
-        </w:rPr>
-        <w:t xml:space="preserve"> Liferay 7, TypeScript, Svelte, React, Node.js, AWS Lambda, </w:t>
-      </w:r>
-      <w:r>
-        <w:rPr>
-          <w:color w:val="444444"/>
-          <w:sz w:val="18"/>
-          <w:szCs w:val="18"/>
-        </w:rPr>
-        <w:t xml:space="preserve">API Gateway, CloudFront, </w:t>
-      </w:r>
-      <w:r>
-        <w:rPr>
-          <w:color w:val="444444"/>
-          <w:sz w:val="18"/>
-          <w:szCs w:val="18"/>
-        </w:rPr>
-        <w:t>Docker/</w:t>
-      </w:r>
-      <w:proofErr w:type="spellStart"/>
-      <w:r>
-        <w:rPr>
-          <w:color w:val="444444"/>
-          <w:sz w:val="18"/>
-          <w:szCs w:val="18"/>
-        </w:rPr>
-        <w:t>Podman</w:t>
-      </w:r>
-      <w:proofErr w:type="spellEnd"/>
-      <w:r>
-        <w:rPr>
-          <w:color w:val="444444"/>
-          <w:sz w:val="18"/>
-          <w:szCs w:val="18"/>
-        </w:rPr>
-        <w:t>, Git</w:t>
-      </w:r>
-    </w:p>
-    <w:p>
-      <w:pPr>
-        <w:spacing w:before="80"/>
-      </w:pPr>
-    </w:p>
-    <w:p>
-      <w:pPr>
-        <w:tabs>
-          <w:tab w:val="right" w:pos="9360"/>
-        </w:tabs>
-        <w:spacing w:before="160" w:after="40"/>
-      </w:pPr>
-      <w:r>
-        <w:rPr>
-          <w:b/>
-          <w:bCs/>
-          <w:sz w:val="22"/>
-          <w:szCs w:val="22"/>
-        </w:rPr>
-        <w:t>Applications Developer</w:t>
-      </w:r>
-      <w:r>
-        <w:rPr>
-          <w:color w:val="505050"/>
-          <w:sz w:val="22"/>
-          <w:szCs w:val="22"/>
-        </w:rPr>
-        <w:t xml:space="preserve"> | </w:t>
-      </w:r>
-      <w:r>
-        <w:rPr>
-          <w:b/>
-          <w:bCs/>
-          <w:color w:val="2A5DB0"/>
-          <w:sz w:val="22"/>
-          <w:szCs w:val="22"/>
-        </w:rPr>
-        <w:t>United Parcel Service (UPS)</w:t>
-      </w:r>
-      <w:r>
-        <w:rPr>
-          <w:color w:val="666666"/>
-        </w:rPr>
-        <w:t xml:space="preserve"> · Louisville, KY</w:t>
-      </w:r>
-      <w:r>
-        <w:rPr>
-          <w:color w:val="666666"/>
-        </w:rPr>
-        <w:tab/>
-        <w:t>2017 – 2019</w:t>
+        <w:t>Engineered backend logic and UI features for real-time transportation visibility systems in a 24/7 high-throughput production environment.</w:t>
       </w:r>
     </w:p>
     <w:p>
@@ -553,7 +484,7 @@
         <w:spacing w:before="40" w:after="40"/>
       </w:pPr>
       <w:r>
-        <w:t>Engineered backend logic and UI features for real-time transportation visibility systems in a 24/7 high-throughput production environment.</w:t>
+        <w:t>Translated business requirements into discrete rules for the Drools inference engine (BRMS), decoupling policy from application code and reducing manual intervention.</w:t>
       </w:r>
     </w:p>
     <w:p>
@@ -566,7 +497,98 @@
         <w:spacing w:before="40" w:after="40"/>
       </w:pPr>
       <w:r>
-        <w:t>Translated business requirements into discrete rules for the Drools inference engine (BRMS), decoupling policy from application code and reducing manual intervention.</w:t>
+        <w:t>Identified and resolved critical latency bottlenecks under peak traffic through targeted performance analysis with JMeter.</w:t>
+      </w:r>
+    </w:p>
+    <w:p>
+      <w:pPr>
+        <w:spacing w:before="60"/>
+      </w:pPr>
+      <w:r>
+        <w:rPr>
+          <w:b/>
+          <w:bCs/>
+          <w:color w:val="444444"/>
+          <w:sz w:val="18"/>
+          <w:szCs w:val="18"/>
+        </w:rPr>
+        <w:t xml:space="preserve">Tech Stack: </w:t>
+      </w:r>
+      <w:r>
+        <w:rPr>
+          <w:color w:val="444444"/>
+          <w:sz w:val="18"/>
+          <w:szCs w:val="18"/>
+        </w:rPr>
+        <w:t>Java, Spring Framework, Maven/Gradle, Drools (BRMS), JMeter, WebLogic, ActiveMQ, SQL Server, TFVC</w:t>
+      </w:r>
+    </w:p>
+    <w:p>
+      <w:pPr>
+        <w:rPr>
+          <w:b/>
+          <w:bCs/>
+          <w:sz w:val="22"/>
+          <w:szCs w:val="22"/>
+        </w:rPr>
+      </w:pPr>
+      <w:r>
+        <w:rPr>
+          <w:b/>
+          <w:bCs/>
+          <w:sz w:val="22"/>
+          <w:szCs w:val="22"/>
+        </w:rPr>
+        <w:br w:type="page"/>
+      </w:r>
+    </w:p>
+    <w:p>
+      <w:pPr>
+        <w:tabs>
+          <w:tab w:val="right" w:pos="9360"/>
+        </w:tabs>
+        <w:spacing w:before="160" w:after="40"/>
+      </w:pPr>
+      <w:r>
+        <w:rPr>
+          <w:b/>
+          <w:bCs/>
+          <w:sz w:val="22"/>
+          <w:szCs w:val="22"/>
+        </w:rPr>
+        <w:lastRenderedPageBreak/>
+        <w:t>Software Developer</w:t>
+      </w:r>
+      <w:r>
+        <w:rPr>
+          <w:color w:val="505050"/>
+          <w:sz w:val="22"/>
+          <w:szCs w:val="22"/>
+        </w:rPr>
+        <w:t xml:space="preserve"> | </w:t>
+      </w:r>
+      <w:r>
+        <w:rPr>
+          <w:b/>
+          <w:bCs/>
+          <w:color w:val="2A5DB0"/>
+          <w:sz w:val="22"/>
+          <w:szCs w:val="22"/>
+        </w:rPr>
+        <w:t>Apax Software</w:t>
+      </w:r>
+      <w:r>
+        <w:rPr>
+          <w:color w:val="666666"/>
+        </w:rPr>
+        <w:t xml:space="preserve"> · Lexington, KY</w:t>
+      </w:r>
+      <w:r>
+        <w:rPr>
+          <w:color w:val="666666"/>
+        </w:rPr>
+        <w:tab/>
+        <w:t>2016 – 2017</w:t>
       </w:r>
     </w:p>
     <w:p>
@@ -579,98 +601,7 @@
         <w:spacing w:before="40" w:after="40"/>
       </w:pPr>
       <w:r>
-        <w:t>Identified and resolved critical latency bottlenecks under peak traffic through targeted performance analysis with JMeter.</w:t>
-      </w:r>
-    </w:p>
-    <w:p>
-      <w:pPr>
-        <w:spacing w:before="60"/>
-      </w:pPr>
-      <w:r>
-        <w:rPr>
-          <w:b/>
-          <w:bCs/>
-          <w:color w:val="444444"/>
-          <w:sz w:val="18"/>
-          <w:szCs w:val="18"/>
-        </w:rPr>
-        <w:t xml:space="preserve">Tech Stack: </w:t>
-      </w:r>
-      <w:r>
-        <w:rPr>
-          <w:color w:val="444444"/>
-          <w:sz w:val="18"/>
-          <w:szCs w:val="18"/>
-        </w:rPr>
-        <w:t>Java, Spring Framework, Maven/Gradle, Drools (BRMS), JMeter, WebLogic, ActiveMQ, SQL Server, TFVC</w:t>
-      </w:r>
-    </w:p>
-    <w:p>
-      <w:pPr>
-        <w:rPr>
-          <w:b/>
-          <w:bCs/>
-          <w:sz w:val="22"/>
-          <w:szCs w:val="22"/>
-        </w:rPr>
-      </w:pPr>
-      <w:r>
-        <w:rPr>
-          <w:b/>
-          <w:bCs/>
-          <w:sz w:val="22"/>
-          <w:szCs w:val="22"/>
-        </w:rPr>
-        <w:br w:type="page"/>
-      </w:r>
-    </w:p>
-    <w:p>
-      <w:pPr>
-        <w:tabs>
-          <w:tab w:val="right" w:pos="9360"/>
-        </w:tabs>
-        <w:spacing w:before="160" w:after="40"/>
-      </w:pPr>
-      <w:r>
-        <w:rPr>
-          <w:b/>
-          <w:bCs/>
-          <w:sz w:val="22"/>
-          <w:szCs w:val="22"/>
-        </w:rPr>
-        <w:lastRenderedPageBreak/>
-        <w:t>Software Developer</w:t>
-      </w:r>
-      <w:r>
-        <w:rPr>
-          <w:color w:val="505050"/>
-          <w:sz w:val="22"/>
-          <w:szCs w:val="22"/>
-        </w:rPr>
-        <w:t xml:space="preserve"> | </w:t>
-      </w:r>
-      <w:r>
-        <w:rPr>
-          <w:b/>
-          <w:bCs/>
-          <w:color w:val="2A5DB0"/>
-          <w:sz w:val="22"/>
-          <w:szCs w:val="22"/>
-        </w:rPr>
-        <w:t>Apax Software</w:t>
-      </w:r>
-      <w:r>
-        <w:rPr>
-          <w:color w:val="666666"/>
-        </w:rPr>
-        <w:t xml:space="preserve"> · Lexington, KY</w:t>
-      </w:r>
-      <w:r>
-        <w:rPr>
-          <w:color w:val="666666"/>
-        </w:rPr>
-        <w:tab/>
-        <w:t>2016 – 2017</w:t>
+        <w:t>Built reusable backend components and modular UI features across multiple client projects, helping teams ship without rebuilding the same foundations.</w:t>
       </w:r>
     </w:p>
     <w:p>
@@ -683,7 +614,7 @@
         <w:spacing w:before="40" w:after="40"/>
       </w:pPr>
       <w:r>
-        <w:t>Built reusable backend components and modular UI features across multiple client projects, helping teams ship without rebuilding the same foundations.</w:t>
+        <w:t>Translated stakeholder requirements into production REST APIs for clients including Presbyterian Church USA and the University of Kentucky.</w:t>
       </w:r>
     </w:p>
     <w:p>
@@ -696,7 +627,83 @@
         <w:spacing w:before="40" w:after="40"/>
       </w:pPr>
       <w:r>
-        <w:t>Translated stakeholder requirements into production REST APIs for clients including Presbyterian Church USA and the University of Kentucky.</w:t>
+        <w:t>Implemented server-side validation, authentication, and RBAC for sensitive event registration and CMS workflows.</w:t>
+      </w:r>
+    </w:p>
+    <w:p>
+      <w:pPr>
+        <w:spacing w:before="60"/>
+      </w:pPr>
+      <w:r>
+        <w:rPr>
+          <w:b/>
+          <w:bCs/>
+          <w:color w:val="444444"/>
+          <w:sz w:val="18"/>
+          <w:szCs w:val="18"/>
+        </w:rPr>
+        <w:t xml:space="preserve">Tech Stack: </w:t>
+      </w:r>
+      <w:r>
+        <w:rPr>
+          <w:color w:val="444444"/>
+          <w:sz w:val="18"/>
+          <w:szCs w:val="18"/>
+        </w:rPr>
+        <w:t>Python, Django, JavaScript (AngularJS, jQuery), PostgreSQL, Bootstrap, AWS, Git, PHP, Drupal</w:t>
+      </w:r>
+    </w:p>
+    <w:p>
+      <w:pPr>
+        <w:spacing w:before="80"/>
+      </w:pPr>
+    </w:p>
+    <w:p>
+      <w:pPr>
+        <w:tabs>
+          <w:tab w:val="right" w:pos="9360"/>
+        </w:tabs>
+        <w:spacing w:before="160" w:after="40"/>
+      </w:pPr>
+      <w:r>
+        <w:rPr>
+          <w:b/>
+          <w:bCs/>
+          <w:sz w:val="22"/>
+          <w:szCs w:val="22"/>
+        </w:rPr>
+        <w:t>Programming Analyst</w:t>
+      </w:r>
+      <w:r>
+        <w:rPr>
+          <w:color w:val="505050"/>
+          <w:sz w:val="22"/>
+          <w:szCs w:val="22"/>
+        </w:rPr>
+        <w:t xml:space="preserve"> | </w:t>
+      </w:r>
+      <w:r>
+        <w:rPr>
+          <w:b/>
+          <w:bCs/>
+          <w:color w:val="2A5DB0"/>
+          <w:sz w:val="22"/>
+          <w:szCs w:val="22"/>
+        </w:rPr>
+        <w:t>Knowledge Facilitations Group (KFG)</w:t>
+      </w:r>
+      <w:r>
+        <w:rPr>
+          <w:color w:val="666666"/>
+        </w:rPr>
+        <w:t xml:space="preserve"> · Richmond, KY</w:t>
+      </w:r>
+      <w:r>
+        <w:rPr>
+          <w:color w:val="666666"/>
+        </w:rPr>
+        <w:tab/>
+        <w:t>2015 – 2016</w:t>
       </w:r>
     </w:p>
     <w:p>
@@ -709,83 +716,7 @@
         <w:spacing w:before="40" w:after="40"/>
       </w:pPr>
       <w:r>
-        <w:t>Implemented server-side validation, authentication, and RBAC for sensitive event registration and CMS workflows.</w:t>
-      </w:r>
-    </w:p>
-    <w:p>
-      <w:pPr>
-        <w:spacing w:before="60"/>
-      </w:pPr>
-      <w:r>
-        <w:rPr>
-          <w:b/>
-          <w:bCs/>
-          <w:color w:val="444444"/>
-          <w:sz w:val="18"/>
-          <w:szCs w:val="18"/>
-        </w:rPr>
-        <w:t xml:space="preserve">Tech Stack: </w:t>
-      </w:r>
-      <w:r>
-        <w:rPr>
-          <w:color w:val="444444"/>
-          <w:sz w:val="18"/>
-          <w:szCs w:val="18"/>
-        </w:rPr>
-        <w:t>Python, Django, JavaScript (AngularJS, jQuery), PostgreSQL, Bootstrap, AWS, Git, PHP, Drupal</w:t>
-      </w:r>
-    </w:p>
-    <w:p>
-      <w:pPr>
-        <w:spacing w:before="80"/>
-      </w:pPr>
-    </w:p>
-    <w:p>
-      <w:pPr>
-        <w:tabs>
-          <w:tab w:val="right" w:pos="9360"/>
-        </w:tabs>
-        <w:spacing w:before="160" w:after="40"/>
-      </w:pPr>
-      <w:r>
-        <w:rPr>
-          <w:b/>
-          <w:bCs/>
-          <w:sz w:val="22"/>
-          <w:szCs w:val="22"/>
-        </w:rPr>
-        <w:t>Programming Analyst</w:t>
-      </w:r>
-      <w:r>
-        <w:rPr>
-          <w:color w:val="505050"/>
-          <w:sz w:val="22"/>
-          <w:szCs w:val="22"/>
-        </w:rPr>
-        <w:t xml:space="preserve"> | </w:t>
-      </w:r>
-      <w:r>
-        <w:rPr>
-          <w:b/>
-          <w:bCs/>
-          <w:color w:val="2A5DB0"/>
-          <w:sz w:val="22"/>
-          <w:szCs w:val="22"/>
-        </w:rPr>
-        <w:t>Knowledge Facilitations Group (KFG)</w:t>
-      </w:r>
-      <w:r>
-        <w:rPr>
-          <w:color w:val="666666"/>
-        </w:rPr>
-        <w:t xml:space="preserve"> · Richmond, KY</w:t>
-      </w:r>
-      <w:r>
-        <w:rPr>
-          <w:color w:val="666666"/>
-        </w:rPr>
-        <w:tab/>
-        <w:t>2015 – 2016</w:t>
+        <w:t>Developed Python-based transformation engines to validate and map disparate industry standards (X12, EDIFACT, XML, JSON) for seamless data exchange across the EDITRACE platform.</w:t>
       </w:r>
     </w:p>
     <w:p>
@@ -798,19 +729,6 @@
         <w:spacing w:before="40" w:after="40"/>
       </w:pPr>
       <w:r>
-        <w:t>Developed Python-based transformation engines to validate and map disparate industry standards (X12, EDIFACT, XML, JSON) for seamless data exchange across the EDITRACE platform.</w:t>
-      </w:r>
-    </w:p>
-    <w:p>
-      <w:pPr>
-        <w:pStyle w:val="ListParagraph"/>
-        <w:numPr>
-          <w:ilvl w:val="0"/>
-          <w:numId w:val="2"/>
-        </w:numPr>
-        <w:spacing w:before="40" w:after="40"/>
-      </w:pPr>
-      <w:r>
         <w:t>Built real-time monitoring dashboards providing immediate visibility into automated EDI data pipelines, reducing troubleshooting time for critical processes.</w:t>
       </w:r>
     </w:p>
@@ -834,25 +752,7 @@
           <w:sz w:val="18"/>
           <w:szCs w:val="18"/>
         </w:rPr>
-        <w:t xml:space="preserve">Python, EDI (X12, XML, EDIFACT, </w:t>
-      </w:r>
-      <w:proofErr w:type="spellStart"/>
-      <w:r>
-        <w:rPr>
-          <w:color w:val="444444"/>
-          <w:sz w:val="18"/>
-          <w:szCs w:val="18"/>
-        </w:rPr>
-        <w:t>Tradacoms</w:t>
-      </w:r>
-      <w:proofErr w:type="spellEnd"/>
-      <w:r>
-        <w:rPr>
-          <w:color w:val="444444"/>
-          <w:sz w:val="18"/>
-          <w:szCs w:val="18"/>
-        </w:rPr>
-        <w:t>, JSON, IDoc), Bootstrap, Git</w:t>
+        <w:t>Python, EDI (X12, XML, EDIFACT, Tradacoms, JSON, IDoc), Bootstrap, Git</w:t>
       </w:r>
     </w:p>
     <w:p>

</xml_diff>

<commit_message>
feat: refresh work stories and visual system
Add accurate FEMA case studies and resume bullets, then restyle
the site with Geist, left-aligned layout, and a white CTA.

Bump the application version to 1.6.0.

Co-authored-by: Cursor <cursoragent@cursor.com>
</commit_message>
<xml_diff>
--- a/public/MatthewSmithResume.docx
+++ b/public/MatthewSmithResume.docx
@@ -181,7 +181,7 @@
         <w:t xml:space="preserve">Frontend: </w:t>
       </w:r>
       <w:r>
-        <w:t>TypeScript, Svelte, React, Angular, GWT, Bootstrap, Tailwind</w:t>
+        <w:t>TypeScript, Svelte, React, Angular, GWT, Bootstrap, Tailwind, Playwright</w:t>
       </w:r>
     </w:p>
     <w:p>
@@ -324,7 +324,7 @@
         <w:spacing w:before="40" w:after="40"/>
       </w:pPr>
       <w:r>
-        <w:t>Designed and built the Svelte frontend for a TypeScript monorepo of AWS serverless applications serving as a unified access portal for FEMA platforms including PrepToolkit, RTLT, RIS, and OneResponder.</w:t>
+        <w:t>Delivered a reusable PrepToolkit calendar portlet configurable for HSEEP or REP, with day, month, year, and 8-year views, filtered event APIs, and PDF export.</w:t>
       </w:r>
     </w:p>
     <w:p>
@@ -337,7 +337,7 @@
         <w:spacing w:before="40" w:after="40"/>
       </w:pPr>
       <w:r>
-        <w:t>Automated enterprise reporting with Docmosis and Apache POI, cutting processing time from hours to minutes for national emergency preparedness programs.</w:t>
+        <w:t>Owned a searchable HSEEP exercise-template library and copy workflow, including permission-aware cross-domain access, selective copying of modules and simulation data, and Playwright coverage for creation and compatibility rules.</w:t>
       </w:r>
     </w:p>
     <w:p>
@@ -350,6 +350,32 @@
         <w:spacing w:before="40" w:after="40"/>
       </w:pPr>
       <w:r>
+        <w:t>Built Svelte access-management UI and TypeScript Lambda APIs in a serverless monorepo, covering user-admin workflows for pending requests, current access, activity history, and bulk site-membership changes.</w:t>
+      </w:r>
+    </w:p>
+    <w:p>
+      <w:pPr>
+        <w:pStyle w:val="ListParagraph"/>
+        <w:numPr>
+          <w:ilvl w:val="0"/>
+          <w:numId w:val="2"/>
+        </w:numPr>
+        <w:spacing w:before="40" w:after="40"/>
+      </w:pPr>
+      <w:r>
+        <w:t>Modernized ten FEMA report and data-extract workflows using MySQL JSON functions and Docmosis templates, including current and legacy routing for changing annual assessment requirements.</w:t>
+      </w:r>
+    </w:p>
+    <w:p>
+      <w:pPr>
+        <w:pStyle w:val="ListParagraph"/>
+        <w:numPr>
+          <w:ilvl w:val="0"/>
+          <w:numId w:val="2"/>
+        </w:numPr>
+        <w:spacing w:before="40" w:after="40"/>
+      </w:pPr>
+      <w:r>
         <w:t>Delivered full-stack features that translated FEMA program requirements (THIRA/SPR, CPG, NIMS, UAWG) into technical solutions in coordination with project leads to meet federal compliance and security standards.</w:t>
       </w:r>
     </w:p>
@@ -405,7 +431,7 @@
           <w:sz w:val="18"/>
           <w:szCs w:val="18"/>
         </w:rPr>
-        <w:t>Docker/Podman, Git</w:t>
+        <w:t>Docker/Podman, Git, Playwright</w:t>
       </w:r>
     </w:p>
     <w:p>

</xml_diff>